<commit_message>
docs: correct and polish reflective report
</commit_message>
<xml_diff>
--- a/Reflective_Report_IncidentIQ.docx
+++ b/Reflective_Report_IncidentIQ.docx
@@ -1124,6 +1124,7 @@
       <w:tr>
         <w:trPr>
           <w:tblHeader w:val="true"/>
+          <w:cantSplit/>
         </w:trPr>
         <w:tc>
           <w:tcPr>
@@ -1242,6 +1243,9 @@
         </w:tc>
       </w:tr>
       <w:tr>
+        <w:trPr>
+          <w:cantSplit/>
+        </w:trPr>
         <w:tc>
           <w:tcPr>
             <w:tcW w:type="dxa" w:w="1958"/>
@@ -1362,6 +1366,9 @@
         </w:tc>
       </w:tr>
       <w:tr>
+        <w:trPr>
+          <w:cantSplit/>
+        </w:trPr>
         <w:tc>
           <w:tcPr>
             <w:tcW w:type="dxa" w:w="1958"/>
@@ -1398,7 +1405,7 @@
               <w:rPr>
                 <w:sz w:val="19"/>
               </w:rPr>
-              <w:t>Timing proximity alone can feel like causal proof, crowding out an equally valid alternative (the traffic increase).</w:t>
+              <w:t>Timing proximity alone can feel like causal proof, crowding out an equally valid alternative (the traffic increase); the causal claim is kept as an Assumption, never a Fact, specifically to guard against this.</w:t>
             </w:r>
           </w:p>
         </w:tc>
@@ -1411,7 +1418,7 @@
               <w:rPr>
                 <w:sz w:val="19"/>
               </w:rPr>
-              <w:t>All three real analysis calls (</w:t>
+              <w:t xml:space="preserve">The post-hoc risk was identified through the scenario design, the evaluation fixture, and the investigation review process. However, it was not consistently named by every real OpenAI response: </w:t>
             </w:r>
             <w:r>
               <w:rPr>
@@ -1424,7 +1431,7 @@
               <w:rPr>
                 <w:sz w:val="19"/>
               </w:rPr>
-              <w:t xml:space="preserve">, </w:t>
+              <w:t xml:space="preserve"> and the sensitivity variant both flagged it explicitly (citing the deploy/error evidence ids), but the saved </w:t>
             </w:r>
             <w:r>
               <w:rPr>
@@ -1437,7 +1444,33 @@
               <w:rPr>
                 <w:sz w:val="19"/>
               </w:rPr>
-              <w:t>, sensitivity variant) independently flagged this bias unprompted, citing the exact deploy/error evidence ids -- a real, evidence-grounded finding, not written for this report.</w:t>
+              <w:t xml:space="preserve"> run's only reasoning-risk finding was </w:t>
+            </w:r>
+            <w:r>
+              <w:rPr>
+                <w:rFonts w:ascii="Consolas" w:hAnsi="Consolas"/>
+                <w:sz w:val="19"/>
+              </w:rPr>
+              <w:t>confirmation-bias</w:t>
+            </w:r>
+            <w:r>
+              <w:rPr>
+                <w:sz w:val="19"/>
+              </w:rPr>
+              <w:t xml:space="preserve">, not </w:t>
+            </w:r>
+            <w:r>
+              <w:rPr>
+                <w:rFonts w:ascii="Consolas" w:hAnsi="Consolas"/>
+                <w:sz w:val="19"/>
+              </w:rPr>
+              <w:t>post-hoc-fallacy</w:t>
+            </w:r>
+            <w:r>
+              <w:rPr>
+                <w:sz w:val="19"/>
+              </w:rPr>
+              <w:t xml:space="preserve"> -- demonstrating that a relevant reasoning risk may still be missed even when the evidence clearly supports it.</w:t>
             </w:r>
           </w:p>
         </w:tc>
@@ -1457,12 +1490,15 @@
               <w:rPr>
                 <w:sz w:val="19"/>
               </w:rPr>
-              <w:t>'s prompt explicitly forbids treating deployment timing alone as causation; the mock provider flags it whenever deployment evidence is present.</w:t>
+              <w:t>'s prompt explicitly forbids treating deployment timing alone as causation and forbids presenting correlation as proven causation; the mock provider flags it whenever deployment evidence is present; the Skeptic Review and contradicting-evidence checks provide an independent second look regardless of whether the first pass named the bias.</w:t>
             </w:r>
           </w:p>
         </w:tc>
       </w:tr>
       <w:tr>
+        <w:trPr>
+          <w:cantSplit/>
+        </w:trPr>
         <w:tc>
           <w:tcPr>
             <w:tcW w:type="dxa" w:w="1958"/>
@@ -1544,6 +1580,9 @@
         </w:tc>
       </w:tr>
       <w:tr>
+        <w:trPr>
+          <w:cantSplit/>
+        </w:trPr>
         <w:tc>
           <w:tcPr>
             <w:tcW w:type="dxa" w:w="1958"/>
@@ -1612,6 +1651,9 @@
         </w:tc>
       </w:tr>
       <w:tr>
+        <w:trPr>
+          <w:cantSplit/>
+        </w:trPr>
         <w:tc>
           <w:tcPr>
             <w:tcW w:type="dxa" w:w="1958"/>
@@ -1786,7 +1828,7 @@
         <w:jc w:val="both"/>
       </w:pPr>
       <w:r>
-        <w:t xml:space="preserve">The most significant documented weakness is the real-provider finding described in Sections 10, 14, and 16: empty contradicting-evidence lists and empty reasoning-risk arrays across every tested real run under </w:t>
+        <w:t xml:space="preserve">The most significant documented weakness is the real-provider finding described in Sections 10, 14, and 16. In the three earlier real-provider </w:t>
       </w:r>
       <w:r>
         <w:rPr>
@@ -1796,7 +1838,27 @@
         <w:t>v1</w:t>
       </w:r>
       <w:r>
-        <w:t>, despite the prompt explicitly requiring both. This is not a hypothetical concern — it is a recorded, evidence-based finding from actual API calls (</w:t>
+        <w:t xml:space="preserve"> runs (a prior development session, three different scenarios), the model returned empty reasoning-risk arrays and empty contradicting-evidence lists, despite the prompt explicitly requiring both. In the later controlled comparison (Section 10), the new </w:t>
+      </w:r>
+      <w:r>
+        <w:rPr>
+          <w:rFonts w:ascii="Consolas" w:hAnsi="Consolas"/>
+          <w:sz w:val="20"/>
+        </w:rPr>
+        <w:t>v1</w:t>
+      </w:r>
+      <w:r>
+        <w:t xml:space="preserve"> run on </w:t>
+      </w:r>
+      <w:r>
+        <w:rPr>
+          <w:rFonts w:ascii="Consolas" w:hAnsi="Consolas"/>
+          <w:sz w:val="20"/>
+        </w:rPr>
+        <w:t>sample-db-connection-leak</w:t>
+      </w:r>
+      <w:r>
+        <w:t xml:space="preserve"> returned one reasoning-risk finding, showing that the behavior was inconsistent rather than universal — a real model does not fail the same way every time, and this report does not claim otherwise. This is not a hypothetical concern — it is a recorded, evidence-based finding from actual API calls (</w:t>
       </w:r>
       <w:r>
         <w:rPr>
@@ -1826,7 +1888,7 @@
         <w:t>recommendedActions</w:t>
       </w:r>
       <w:r>
-        <w:t xml:space="preserve"> was also inconsistent across real runs — populated in two of three, empty in one. These findings directly shaped this project's design: the completeness quality gate and the targeted completion- repair pass exist specifically because an AI response can be schema-valid and still meaningfully incomplete.</w:t>
+        <w:t xml:space="preserve"> was also inconsistent across the earlier real runs — populated in two of three, empty in one. These findings directly shaped this project's design: the completeness quality gate and the targeted completion- repair pass exist specifically because an AI response can be schema-valid and still meaningfully incomplete, and because that incompleteness is not consistent enough to predict or rule out in advance.</w:t>
       </w:r>
     </w:p>
     <w:p>

</xml_diff>

<commit_message>
docs: fix reflective report table pagination
</commit_message>
<xml_diff>
--- a/Reflective_Report_IncidentIQ.docx
+++ b/Reflective_Report_IncidentIQ.docx
@@ -1105,6 +1105,14 @@
       </w:r>
       <w:r>
         <w:t>.</w:t>
+      </w:r>
+    </w:p>
+    <w:p>
+      <w:pPr>
+        <w:spacing w:before="0" w:after="0"/>
+      </w:pPr>
+      <w:r>
+        <w:br w:type="page"/>
       </w:r>
     </w:p>
     <w:tbl>

</xml_diff>